<commit_message>
Fix hardcoded Horwath client data in MSA master template
- Replace hardcoded "Horwath HTL" with {{CLIENT_LEGAL_NAME}} placeholder
- Replace hardcoded Zagreb address with {{CLIENT_REGISTERED_ADDRESS}} placeholder
- Add CLIENT_LEGAL_NAME and CLIENT_REGISTERED_ADDRESS to required placeholders
- Remove obsolete CLIENT_ADDRESS and SOF_REGISTERED_ADDRESS from optional placeholders
- Update validation error messages for new required fields
- Update test script with new placeholder values

This ensures no client-specific data from previous contracts appears in
documents generated for other clients.

🤖 Generated with [Claude Code](https://claude.com/claude-code)

Co-Authored-By: Claude Opus 4.5 <noreply@anthropic.com>
</commit_message>
<xml_diff>
--- a/public/templates/myRA_MSA_MASTER.docx
+++ b/public/templates/myRA_MSA_MASTER.docx
@@ -220,22 +220,7 @@
           <w:b/>
           <w:bCs/>
         </w:rPr>
-        <w:t xml:space="preserve">Horwath </w:t>
-      </w:r>
-      <w:proofErr w:type="spellStart"/>
-      <w:r>
-        <w:rPr>
-          <w:b/>
-          <w:bCs/>
-        </w:rPr>
-        <w:t>HT</w:t>
-      </w:r>
-      <w:r>
-        <w:rPr>
-          <w:b/>
-          <w:bCs/>
-        </w:rPr>
-        <w:t>L</w:t>
+        <w:t>{{CLIENT_LEGAL_NAME}}</w:t>
       </w:r>
       <w:proofErr w:type="gramStart"/>
       <w:r>
@@ -289,14 +274,14 @@
           <w:rFonts w:ascii="Calibri" w:eastAsia="Times New Roman" w:hAnsi="Calibri" w:cs="Calibri"/>
           <w:lang w:eastAsia="en-GB"/>
         </w:rPr>
-        <w:t xml:space="preserve">Office Management in </w:t>
-      </w:r>
-      <w:r>
-        <w:rPr>
-          <w:rFonts w:ascii="Calibri" w:eastAsia="Times New Roman" w:hAnsi="Calibri" w:cs="Calibri"/>
-          <w:lang w:eastAsia="en-GB"/>
-        </w:rPr>
-        <w:t>Matrix</w:t>
+        <w:t xml:space="preserve"/>
+      </w:r>
+      <w:r>
+        <w:rPr>
+          <w:rFonts w:ascii="Calibri" w:eastAsia="Times New Roman" w:hAnsi="Calibri" w:cs="Calibri"/>
+          <w:lang w:eastAsia="en-GB"/>
+        </w:rPr>
+        <w:t>{{CLIENT_REGISTERED_ADDRESS}}</w:t>
       </w:r>
       <w:r>
         <w:rPr>
@@ -310,7 +295,7 @@
           <w:rFonts w:ascii="Calibri" w:eastAsia="Times New Roman" w:hAnsi="Calibri" w:cs="Calibri"/>
           <w:lang w:eastAsia="en-GB"/>
         </w:rPr>
-        <w:t>Office</w:t>
+        <w:t/>
       </w:r>
       <w:r>
         <w:rPr>
@@ -324,7 +309,7 @@
           <w:rFonts w:ascii="Calibri" w:eastAsia="Times New Roman" w:hAnsi="Calibri" w:cs="Calibri"/>
           <w:lang w:eastAsia="en-GB"/>
         </w:rPr>
-        <w:t>Park,</w:t>
+        <w:t/>
       </w:r>
       <w:r>
         <w:rPr>
@@ -339,7 +324,7 @@
           <w:rFonts w:ascii="Calibri" w:eastAsia="Times New Roman" w:hAnsi="Calibri" w:cs="Calibri"/>
           <w:lang w:eastAsia="en-GB"/>
         </w:rPr>
-        <w:t>Slavonska</w:t>
+        <w:t/>
       </w:r>
       <w:proofErr w:type="spellEnd"/>
       <w:r>
@@ -355,7 +340,7 @@
           <w:rFonts w:ascii="Calibri" w:eastAsia="Times New Roman" w:hAnsi="Calibri" w:cs="Calibri"/>
           <w:lang w:eastAsia="en-GB"/>
         </w:rPr>
-        <w:t>Avenija</w:t>
+        <w:t/>
       </w:r>
       <w:proofErr w:type="spellEnd"/>
       <w:r>
@@ -363,7 +348,7 @@
           <w:rFonts w:ascii="Calibri" w:eastAsia="Times New Roman" w:hAnsi="Calibri" w:cs="Calibri"/>
           <w:lang w:eastAsia="en-GB"/>
         </w:rPr>
-        <w:t xml:space="preserve"> 1B,</w:t>
+        <w:t/>
       </w:r>
       <w:r>
         <w:rPr>
@@ -377,21 +362,21 @@
           <w:rFonts w:ascii="Calibri" w:eastAsia="Times New Roman" w:hAnsi="Calibri" w:cs="Calibri"/>
           <w:lang w:eastAsia="en-GB"/>
         </w:rPr>
-        <w:t>Building B, 5th Floor</w:t>
-      </w:r>
-      <w:r>
-        <w:rPr>
-          <w:rFonts w:ascii="Calibri" w:eastAsia="Times New Roman" w:hAnsi="Calibri" w:cs="Calibri"/>
-          <w:lang w:eastAsia="en-GB"/>
-        </w:rPr>
-        <w:t xml:space="preserve">, </w:t>
-      </w:r>
-      <w:r>
-        <w:rPr>
-          <w:rFonts w:ascii="Calibri" w:eastAsia="Times New Roman" w:hAnsi="Calibri" w:cs="Calibri"/>
-          <w:lang w:eastAsia="en-GB"/>
-        </w:rPr>
-        <w:t>10000 Zagreb, {{CLIENT_COUNTRY}}</w:t>
+        <w:t/>
+      </w:r>
+      <w:r>
+        <w:rPr>
+          <w:rFonts w:ascii="Calibri" w:eastAsia="Times New Roman" w:hAnsi="Calibri" w:cs="Calibri"/>
+          <w:lang w:eastAsia="en-GB"/>
+        </w:rPr>
+        <w:t/>
+      </w:r>
+      <w:r>
+        <w:rPr>
+          <w:rFonts w:ascii="Calibri" w:eastAsia="Times New Roman" w:hAnsi="Calibri" w:cs="Calibri"/>
+          <w:lang w:eastAsia="en-GB"/>
+        </w:rPr>
+        <w:t>{{CLIENT_COUNTRY}}</w:t>
       </w:r>
       <w:r>
         <w:rPr>
@@ -4489,7 +4474,7 @@
           <w:iCs/>
           <w:lang w:eastAsia="en-GB"/>
         </w:rPr>
-        <w:t xml:space="preserve">, </w:t>
+        <w:t/>
       </w:r>
       <w:r>
         <w:rPr>
@@ -11597,14 +11582,14 @@
           <w:rFonts w:ascii="Calibri" w:eastAsia="Times New Roman" w:hAnsi="Calibri" w:cs="Calibri"/>
           <w:lang w:eastAsia="en-GB"/>
         </w:rPr>
-        <w:t xml:space="preserve">Office Management in </w:t>
-      </w:r>
-      <w:r>
-        <w:rPr>
-          <w:rFonts w:ascii="Calibri" w:eastAsia="Times New Roman" w:hAnsi="Calibri" w:cs="Calibri"/>
-          <w:lang w:eastAsia="en-GB"/>
-        </w:rPr>
-        <w:t>Matrix</w:t>
+        <w:t xml:space="preserve"/>
+      </w:r>
+      <w:r>
+        <w:rPr>
+          <w:rFonts w:ascii="Calibri" w:eastAsia="Times New Roman" w:hAnsi="Calibri" w:cs="Calibri"/>
+          <w:lang w:eastAsia="en-GB"/>
+        </w:rPr>
+        <w:t>{{CLIENT_REGISTERED_ADDRESS}}</w:t>
       </w:r>
       <w:r>
         <w:rPr>
@@ -11618,7 +11603,7 @@
           <w:rFonts w:ascii="Calibri" w:eastAsia="Times New Roman" w:hAnsi="Calibri" w:cs="Calibri"/>
           <w:lang w:eastAsia="en-GB"/>
         </w:rPr>
-        <w:t>Office</w:t>
+        <w:t/>
       </w:r>
       <w:r>
         <w:rPr>
@@ -11632,7 +11617,7 @@
           <w:rFonts w:ascii="Calibri" w:eastAsia="Times New Roman" w:hAnsi="Calibri" w:cs="Calibri"/>
           <w:lang w:eastAsia="en-GB"/>
         </w:rPr>
-        <w:t>Park,</w:t>
+        <w:t/>
       </w:r>
       <w:r>
         <w:rPr>
@@ -11647,7 +11632,7 @@
           <w:rFonts w:ascii="Calibri" w:eastAsia="Times New Roman" w:hAnsi="Calibri" w:cs="Calibri"/>
           <w:lang w:eastAsia="en-GB"/>
         </w:rPr>
-        <w:t>Slavonska</w:t>
+        <w:t/>
       </w:r>
       <w:proofErr w:type="spellEnd"/>
       <w:r>
@@ -11663,7 +11648,7 @@
           <w:rFonts w:ascii="Calibri" w:eastAsia="Times New Roman" w:hAnsi="Calibri" w:cs="Calibri"/>
           <w:lang w:eastAsia="en-GB"/>
         </w:rPr>
-        <w:t>Avenija</w:t>
+        <w:t/>
       </w:r>
       <w:proofErr w:type="spellEnd"/>
       <w:r>
@@ -11671,7 +11656,7 @@
           <w:rFonts w:ascii="Calibri" w:eastAsia="Times New Roman" w:hAnsi="Calibri" w:cs="Calibri"/>
           <w:lang w:eastAsia="en-GB"/>
         </w:rPr>
-        <w:t xml:space="preserve"> 1B,</w:t>
+        <w:t/>
       </w:r>
       <w:r>
         <w:rPr>
@@ -11685,21 +11670,21 @@
           <w:rFonts w:ascii="Calibri" w:eastAsia="Times New Roman" w:hAnsi="Calibri" w:cs="Calibri"/>
           <w:lang w:eastAsia="en-GB"/>
         </w:rPr>
-        <w:t>Building B, 5th Floor</w:t>
-      </w:r>
-      <w:r>
-        <w:rPr>
-          <w:rFonts w:ascii="Calibri" w:eastAsia="Times New Roman" w:hAnsi="Calibri" w:cs="Calibri"/>
-          <w:lang w:eastAsia="en-GB"/>
-        </w:rPr>
-        <w:t xml:space="preserve">, </w:t>
-      </w:r>
-      <w:r>
-        <w:rPr>
-          <w:rFonts w:ascii="Calibri" w:eastAsia="Times New Roman" w:hAnsi="Calibri" w:cs="Calibri"/>
-          <w:lang w:eastAsia="en-GB"/>
-        </w:rPr>
-        <w:t xml:space="preserve">10000 Zagreb, </w:t>
+        <w:t/>
+      </w:r>
+      <w:r>
+        <w:rPr>
+          <w:rFonts w:ascii="Calibri" w:eastAsia="Times New Roman" w:hAnsi="Calibri" w:cs="Calibri"/>
+          <w:lang w:eastAsia="en-GB"/>
+        </w:rPr>
+        <w:t/>
+      </w:r>
+      <w:r>
+        <w:rPr>
+          <w:rFonts w:ascii="Calibri" w:eastAsia="Times New Roman" w:hAnsi="Calibri" w:cs="Calibri"/>
+          <w:lang w:eastAsia="en-GB"/>
+        </w:rPr>
+        <w:t/>
       </w:r>
       <w:r>
         <w:rPr>

</xml_diff>